<commit_message>
Deploying to gh-pages from @ d-morrison/wai@18ac1f923d01c250e22cd4e090906901b57ee4cf 🚀
</commit_message>
<xml_diff>
--- a/chapters/pr-workflow-with-agents.docx
+++ b/chapters/pr-workflow-with-agents.docx
@@ -15,7 +15,7 @@
         <w:pStyle w:val="Date"/>
       </w:pPr>
       <w:r>
-        <w:t xml:space="preserve">Last modified: 2026-07-15 23:18:00 (PDT)</w:t>
+        <w:t xml:space="preserve">Last modified: 2026-07-22 00:47:15 (PDT)</w:t>
       </w:r>
     </w:p>
     <w:p>
@@ -5824,6 +5824,102 @@
         <w:t xml:space="preserve">’s scope note); report the evidence and let the human decide whether to override, fix the guard script, or relax branch protection. (Learned on sparta#590/#594/#598, 2026-07-02: two independent PRs hit the inverse misfire in the same session, and an attempt to merge past the required check on verified-clean content was correctly blocked by the harness’s own permission system.)</w:t>
       </w:r>
     </w:p>
+    <w:p>
+      <w:pPr>
+        <w:pStyle w:val="BodyText"/>
+      </w:pPr>
+      <w:r>
+        <w:rPr>
+          <w:b/>
+          <w:bCs/>
+        </w:rPr>
+        <w:t xml:space="preserve">A third case, distinct from either misfire above: some checks are designed to NEVER fail regardless of their own posted content, so their green color carries zero signal at all.</w:t>
+      </w:r>
+      <w:r>
+        <w:t xml:space="preserve"> </w:t>
+      </w:r>
+      <w:r>
+        <w:t xml:space="preserve">A CI-runner-relative benchmark check that gates a soft threshold (e.g. </w:t>
+      </w:r>
+      <w:r>
+        <w:t xml:space="preserve">“regressed beyond 20% vs. baseline”</w:t>
+      </w:r>
+      <w:r>
+        <w:t xml:space="preserve">) may deliberately report success/pass at the GitHub-check level even when it posts a</w:t>
+      </w:r>
+      <w:r>
+        <w:t xml:space="preserve"> </w:t>
+      </w:r>
+      <w:r>
+        <w:rPr>
+          <w:rStyle w:val="VerbatimChar"/>
+        </w:rPr>
+        <w:t xml:space="preserve">:warning:</w:t>
+      </w:r>
+      <w:r>
+        <w:t xml:space="preserve"> </w:t>
+      </w:r>
+      <w:r>
+        <w:t xml:space="preserve">regression comment, precisely because the project has decided that threshold is</w:t>
+      </w:r>
+      <w:r>
+        <w:t xml:space="preserve"> </w:t>
+      </w:r>
+      <w:r>
+        <w:t xml:space="preserve">“a human call, not an auto-block”</w:t>
+      </w:r>
+      <w:r>
+        <w:t xml:space="preserve"> </w:t>
+      </w:r>
+      <w:r>
+        <w:t xml:space="preserve">rather than a hard gate.</w:t>
+      </w:r>
+      <w:r>
+        <w:t xml:space="preserve"> </w:t>
+      </w:r>
+      <w:r>
+        <w:rPr>
+          <w:rStyle w:val="VerbatimChar"/>
+        </w:rPr>
+        <w:t xml:space="preserve">gh pr checks</w:t>
+      </w:r>
+      <w:r>
+        <w:t xml:space="preserve"> </w:t>
+      </w:r>
+      <w:r>
+        <w:t xml:space="preserve">(or the equivalent status API) showing this check as PASS is consequently not evidence there is nothing to look at — it only means the check ran, not that its content was clean. Read the check’s own posted comment body every time, the same discipline the review-job case above already demands, but don’t expect the check’s pass/fail conclusion to ever flip for this class of check even on a real, large regression. (Sparta#995/#998/#999, 2026-07-19:</w:t>
+      </w:r>
+      <w:r>
+        <w:t xml:space="preserve"> </w:t>
+      </w:r>
+      <w:r>
+        <w:rPr>
+          <w:rStyle w:val="VerbatimChar"/>
+        </w:rPr>
+        <w:t xml:space="preserve">gh pr checks</w:t>
+      </w:r>
+      <w:r>
+        <w:t xml:space="preserve"> </w:t>
+      </w:r>
+      <w:r>
+        <w:t xml:space="preserve">reported</w:t>
+      </w:r>
+      <w:r>
+        <w:t xml:space="preserve"> </w:t>
+      </w:r>
+      <w:r>
+        <w:rPr>
+          <w:rStyle w:val="VerbatimChar"/>
+        </w:rPr>
+        <w:t xml:space="preserve">benchmark</w:t>
+      </w:r>
+      <w:r>
+        <w:t xml:space="preserve"> </w:t>
+      </w:r>
+      <w:r>
+        <w:t xml:space="preserve">as PASS across three separate PRs while the actual posted comment showed regressions of 45%, 38.8%, and 36.9% respectively against the CI-runner baseline — two were real, fixable redundant-computation bugs; the third traced to a stale baseline that predated an earlier PR’s own accepted cost increase and hadn’t been refreshed yet, since the refresh workflow only runs on a weekly schedule, not on every main push.)</w:t>
+      </w:r>
+    </w:p>
     <w:bookmarkEnd w:id="23"/>
     <w:bookmarkStart w:id="24" w:name="address-every-in-scope-review-comment"/>
     <w:p>
@@ -6109,6 +6205,192 @@
       </w:r>
       <w:r>
         <w:t xml:space="preserve">thread along the way, leaving only the final all-clear exchange.</w:t>
+      </w:r>
+    </w:p>
+    <w:p>
+      <w:pPr>
+        <w:pStyle w:val="BodyText"/>
+      </w:pPr>
+      <w:r>
+        <w:rPr>
+          <w:b/>
+          <w:bCs/>
+        </w:rPr>
+        <w:t xml:space="preserve">Always resolve an inline thread the moment its comment is successfully</w:t>
+      </w:r>
+      <w:r>
+        <w:rPr>
+          <w:b/>
+          <w:bCs/>
+        </w:rPr>
+        <w:t xml:space="preserve"> </w:t>
+      </w:r>
+      <w:r>
+        <w:rPr>
+          <w:b/>
+          <w:bCs/>
+        </w:rPr>
+        <w:t xml:space="preserve">addressed</w:t>
+      </w:r>
+      <w:r>
+        <w:t xml:space="preserve"> </w:t>
+      </w:r>
+      <w:r>
+        <w:t xml:space="preserve">— the fix pushed and a reply posted naming it — in the same</w:t>
+      </w:r>
+      <w:r>
+        <w:t xml:space="preserve"> </w:t>
+      </w:r>
+      <w:r>
+        <w:t xml:space="preserve">pass, whatever workflow you’re in: a formal</w:t>
+      </w:r>
+      <w:r>
+        <w:t xml:space="preserve"> </w:t>
+      </w:r>
+      <w:r>
+        <w:rPr>
+          <w:rStyle w:val="VerbatimChar"/>
+        </w:rPr>
+        <w:t xml:space="preserve">ard</w:t>
+      </w:r>
+      <w:r>
+        <w:t xml:space="preserve">/</w:t>
+      </w:r>
+      <w:r>
+        <w:rPr>
+          <w:rStyle w:val="VerbatimChar"/>
+        </w:rPr>
+        <w:t xml:space="preserve">ardi</w:t>
+      </w:r>
+      <w:r>
+        <w:t xml:space="preserve"> </w:t>
+      </w:r>
+      <w:r>
+        <w:t xml:space="preserve">round, a CI-monitor</w:t>
+      </w:r>
+      <w:r>
+        <w:t xml:space="preserve"> </w:t>
+      </w:r>
+      <w:r>
+        <w:t xml:space="preserve">nudge, or a one-off fix outside any loop. Addressing without resolving leaves</w:t>
+      </w:r>
+      <w:r>
+        <w:t xml:space="preserve"> </w:t>
+      </w:r>
+      <w:r>
+        <w:t xml:space="preserve">a thread that reads as outstanding work to every later reviewer, blocks</w:t>
+      </w:r>
+      <w:r>
+        <w:t xml:space="preserve"> </w:t>
+      </w:r>
+      <w:hyperlink r:id="rId14">
+        <w:r>
+          <w:rPr>
+            <w:rStyle w:val="VerbatimChar"/>
+          </w:rPr>
+          <w:t xml:space="preserve">fully-clean</w:t>
+        </w:r>
+      </w:hyperlink>
+      <w:r>
+        <w:t xml:space="preserve">’s every-inline-thread-resolved criterion, and</w:t>
+      </w:r>
+      <w:r>
+        <w:t xml:space="preserve"> </w:t>
+      </w:r>
+      <w:r>
+        <w:t xml:space="preserve">drags stale noise into the next review round. The per-disposition settlement</w:t>
+      </w:r>
+      <w:r>
+        <w:t xml:space="preserve"> </w:t>
+      </w:r>
+      <w:r>
+        <w:t xml:space="preserve">rules in</w:t>
+      </w:r>
+      <w:r>
+        <w:t xml:space="preserve"> </w:t>
+      </w:r>
+      <w:r>
+        <w:rPr>
+          <w:rStyle w:val="VerbatimChar"/>
+        </w:rPr>
+        <w:t xml:space="preserve">ard</w:t>
+      </w:r>
+      <w:r>
+        <w:t xml:space="preserve"> </w:t>
+      </w:r>
+      <w:r>
+        <w:t xml:space="preserve">step 4b still govern the exceptions: a</w:t>
+      </w:r>
+      <w:r>
+        <w:t xml:space="preserve"> </w:t>
+      </w:r>
+      <w:r>
+        <w:rPr>
+          <w:b/>
+          <w:bCs/>
+        </w:rPr>
+        <w:t xml:space="preserve">Rebut</w:t>
+      </w:r>
+      <w:r>
+        <w:t xml:space="preserve"> </w:t>
+      </w:r>
+      <w:r>
+        <w:t xml:space="preserve">stays open</w:t>
+      </w:r>
+      <w:r>
+        <w:t xml:space="preserve"> </w:t>
+      </w:r>
+      <w:r>
+        <w:t xml:space="preserve">until the reviewer drops it, and an</w:t>
+      </w:r>
+      <w:r>
+        <w:t xml:space="preserve"> </w:t>
+      </w:r>
+      <w:r>
+        <w:rPr>
+          <w:b/>
+          <w:bCs/>
+        </w:rPr>
+        <w:t xml:space="preserve">Address</w:t>
+      </w:r>
+      <w:r>
+        <w:t xml:space="preserve"> </w:t>
+      </w:r>
+      <w:r>
+        <w:t xml:space="preserve">you’re not confident fully</w:t>
+      </w:r>
+      <w:r>
+        <w:t xml:space="preserve"> </w:t>
+      </w:r>
+      <w:r>
+        <w:t xml:space="preserve">settles the concern gets a reply asking for confirmation instead of a</w:t>
+      </w:r>
+      <w:r>
+        <w:t xml:space="preserve"> </w:t>
+      </w:r>
+      <w:r>
+        <w:t xml:space="preserve">resolve. The</w:t>
+      </w:r>
+      <w:r>
+        <w:t xml:space="preserve"> </w:t>
+      </w:r>
+      <w:r>
+        <w:rPr>
+          <w:rStyle w:val="VerbatimChar"/>
+        </w:rPr>
+        <w:t xml:space="preserve">resolve-pr-threads</w:t>
+      </w:r>
+      <w:r>
+        <w:t xml:space="preserve"> </w:t>
+      </w:r>
+      <w:r>
+        <w:t xml:space="preserve">skill sweeps any stragglers, but it’s a</w:t>
+      </w:r>
+      <w:r>
+        <w:t xml:space="preserve"> </w:t>
+      </w:r>
+      <w:r>
+        <w:t xml:space="preserve">backstop — resolve-on-address is the default, not a cleanup step.</w:t>
       </w:r>
     </w:p>
     <w:p>

</xml_diff>